<commit_message>
feat: consolida TAP sem conteúdo contratual e prepara publicação no GitHub Pages
- TAP consolidado (entregas/tarefa-1-revisada.md e .docx): obtenção contratual
  tratada como premissa concluída; projeto restrito a recebimento, integração,
  validação e capacitação. Alterações de consistência registradas (A1 a A25);
  original preservado em tarefas/.
- Tarefas 2 e 3, auditoria cruzada e index.html atualizados para a numeração
  do TAP consolidado; conflito C1 resolvido; 17/17 requisitos de alto nível
  rastreados.
- README com endereço e configuração do GitHub Pages; metadados de
  compartilhamento e ícone no index.html.

Co-Authored-By: Claude Opus 5.5 <noreply@anthropic.com>
Claude-Session: https://claude.ai/code/session_013BW1DyLbnQ4dBmJfp5Vwg3
</commit_message>
<xml_diff>
--- a/entregas/tarefa-2-revisada.docx
+++ b/entregas/tarefa-2-revisada.docx
@@ -61,7 +61,7 @@
         <w:t xml:space="preserve"> </w:t>
       </w:r>
       <w:r>
-        <w:t xml:space="preserve">Tarefa 1 (TAP) · críticas e decisões do orientador (Cmdt Huback) · Dez Mandamentos da EAP</w:t>
+        <w:t xml:space="preserve">Tarefa 1 (TAP consolidado) · críticas e decisões do orientador (Cmdt Huback) · Dez Mandamentos da EAP</w:t>
       </w:r>
     </w:p>
     <w:p>
@@ -419,7 +419,7 @@
         <w:pStyle w:val="FirstParagraph"/>
       </w:pPr>
       <w:r>
-        <w:t xml:space="preserve">O projeto ROV-MB tem por objetivo especificar, adquirir, integrar e validar um veículo submarino operado remotamente (ROV) modular, destinado à inspeção visual e à busca de objetos submersos pela Marinha do Brasil. O MVP será operado a partir de terra, por um militar especializado treinado, em água doce e salgada, com câmera e iluminação como núcleo funcional, dentro do envelope operacional aprovado (profundidade nominal de 10 m, máxima de 30 m, autonomia mínima de 2h30). A modularidade é requisito obrigatório da arquitetura, mesmo que os módulos adicionais (sonar, garra/manipulador) não integrem o MVP.</w:t>
+        <w:t xml:space="preserve">O projeto ROV-MB tem por objetivo especificar, receber, integrar e validar um veículo submarino operado remotamente (ROV) modular, destinado à inspeção visual e à busca de objetos submersos pela Marinha do Brasil. O MVP será operado a partir de terra, por um militar especializado treinado, em água doce e salgada, com câmera e iluminação como núcleo funcional, dentro do envelope operacional aprovado (profundidade nominal de 10 m, máxima de 30 m, autonomia mínima de 2h30). A modularidade é requisito obrigatório da arquitetura, mesmo que os módulos adicionais (sonar, garra/manipulador) não integrem o MVP. A obtenção contratual do sistema é premissa concluída e não integra o projeto.</w:t>
       </w:r>
     </w:p>
     <w:p>
@@ -1869,7 +1869,7 @@
               <w:rPr>
                 <w:sz w:val="18"/>
               </w:rPr>
-              <w:t xml:space="preserve">Necessidade operacional validada pelos usuários representativos; CONOPS, envelope operacional, arquitetura modular com configuração do MVP e requisitos com critérios de aceitação rastreáveis aprovados formalmente pela Força de Submarinos (TAP, seção 3, item 18; seção 6, item 9; seção 13).</w:t>
+              <w:t xml:space="preserve">Necessidade operacional validada pelos usuários representativos; CONOPS, envelope operacional, arquitetura modular com configuração do MVP e requisitos com critérios de aceitação rastreáveis aprovados formalmente pela Força de Submarinos (TAP, seção 3, item 17; seção 6, item 9; seção 13).</w:t>
             </w:r>
           </w:p>
         </w:tc>
@@ -2133,7 +2133,7 @@
               <w:rPr>
                 <w:sz w:val="18"/>
               </w:rPr>
-              <w:t xml:space="preserve">Planilhas do TAF e do TAM aprovadas pela Força de Submarinos antes do início da respectiva bateria de testes, com todos os requisitos verificáveis vinculados a teste e critério de aprovação; planilhas executadas aprovadas, com 100% dos testes críticos aprovados ou formalmente dispensados (TAP, seção 3, itens 15 e 18; seção 10, indicador 8.2; seção 15).</w:t>
+              <w:t xml:space="preserve">Planilhas do TAF e do TAM aprovadas pela Força de Submarinos antes do início da respectiva bateria de testes, com todos os requisitos verificáveis vinculados a teste e critério de aprovação; planilhas executadas aprovadas, com 100% dos testes críticos aprovados ou formalmente dispensados (TAP, seção 3, itens 15 e 17; seção 10, indicador 10.2; seção 15).</w:t>
             </w:r>
           </w:p>
         </w:tc>
@@ -2199,7 +2199,7 @@
               <w:rPr>
                 <w:sz w:val="18"/>
               </w:rPr>
-              <w:t xml:space="preserve">100% dos itens da lista aprovada recebidos e conferidos (quantidade, identificação e estado), com inventário inicial registrado e divergências tratadas antes da aprovação do recebimento (TAP, seção 10, indicador 8.4; seção 15).</w:t>
+              <w:t xml:space="preserve">100% dos itens da lista aprovada recebidos e conferidos (quantidade, identificação e estado), com inventário inicial registrado e divergências tratadas antes da aprovação do recebimento (TAP, seção 10, indicador 10.4; seção 15).</w:t>
             </w:r>
           </w:p>
         </w:tc>
@@ -2249,23 +2249,23 @@
               <w:rPr>
                 <w:sz w:val="18"/>
               </w:rPr>
-              <w:t xml:space="preserve">Entrega da organização preparada para operar e manter a configuração inicial do ROV (TAP, objetivo 7): operadores e mantenedores capacitados, piloto operacional avaliado, documentação técnica aprovada e conhecimento do sistema transferido e sustentado. Decomposto em cursos e piloto operacional (4.1) e documentação técnica e gestão do conhecimento (4.2).</w:t>
-            </w:r>
-          </w:p>
-        </w:tc>
-        <w:tc>
-          <w:tcPr/>
-          <w:p>
-            <w:pPr>
-              <w:pStyle w:val="Compact"/>
-              <w:spacing w:after="40"/>
-              <w:jc w:val="left"/>
-            </w:pPr>
-            <w:r>
-              <w:rPr>
-                <w:sz w:val="18"/>
-              </w:rPr>
-              <w:t xml:space="preserve">Aceitação de 4.1 e 4.2: curso básico, documentação e plano de manutenção entregues e piloto operacional avaliado e aprovado pela Força de Submarinos (TAP, seção 10, indicadores 8.4 e 8.5; seção 15).</w:t>
+              <w:t xml:space="preserve">Entrega da organização preparada para operar e manter a configuração inicial do ROV (TAP, objetivo 6): operadores e mantenedores capacitados, piloto operacional avaliado, documentação técnica aprovada e conhecimento do sistema transferido e sustentado. Decomposto em cursos e piloto operacional (4.1) e documentação técnica e gestão do conhecimento (4.2).</w:t>
+            </w:r>
+          </w:p>
+        </w:tc>
+        <w:tc>
+          <w:tcPr/>
+          <w:p>
+            <w:pPr>
+              <w:pStyle w:val="Compact"/>
+              <w:spacing w:after="40"/>
+              <w:jc w:val="left"/>
+            </w:pPr>
+            <w:r>
+              <w:rPr>
+                <w:sz w:val="18"/>
+              </w:rPr>
+              <w:t xml:space="preserve">Aceitação de 4.1 e 4.2: curso básico, documentação e plano de manutenção entregues e piloto operacional avaliado e aprovado pela Força de Submarinos (TAP, seção 10, indicadores 10.4 e 10.5; seção 15).</w:t>
             </w:r>
           </w:p>
         </w:tc>
@@ -2331,7 +2331,7 @@
               <w:rPr>
                 <w:sz w:val="18"/>
               </w:rPr>
-              <w:t xml:space="preserve">Operadores e mantenedores designados aprovados na avaliação de competência mínima; piloto operacional executado por militar treinado dentro dos limites de segurança aprovados; relatório de avaliação do piloto aprovado pela Força de Submarinos (TAP, seção 10, indicador 8.5).</w:t>
+              <w:t xml:space="preserve">Operadores e mantenedores designados aprovados na avaliação de competência mínima; piloto operacional executado por militar treinado dentro dos limites de segurança aprovados; relatório de avaliação do piloto aprovado pela Força de Submarinos (TAP, seção 10, indicador 10.5).</w:t>
             </w:r>
           </w:p>
         </w:tc>
@@ -2397,7 +2397,7 @@
               <w:rPr>
                 <w:sz w:val="18"/>
               </w:rPr>
-              <w:t xml:space="preserve">Manuais de operação, de manutenção e técnico aprovados, contemplando todos os procedimentos do TAP (seção 3, item 12); plano de manutenção entregue; documentação consolidada na configuração final e disponibilizada às organizações usuárias (TAP, seção 10, indicador 8.4; seção 15).</w:t>
+              <w:t xml:space="preserve">Manuais de operação, de manutenção e técnico aprovados, contemplando todos os procedimentos do TAP (seção 3, item 12); plano de manutenção entregue; documentação consolidada na configuração final e disponibilizada às organizações usuárias (TAP, seção 10, indicador 10.4; seção 15).</w:t>
             </w:r>
           </w:p>
         </w:tc>
@@ -2425,13 +2425,31 @@
           <w:bCs/>
           <w:b/>
         </w:rPr>
+        <w:t xml:space="preserve">Premissa — obtenção contratual concluída.</w:t>
+      </w:r>
+      <w:r>
+        <w:t xml:space="preserve"> </w:t>
+      </w:r>
+      <w:r>
+        <w:t xml:space="preserve">O processo contratual (pesquisa de mercado, definição da solução e contratação) é considerado já realizado e não integra o projeto (TAP consolidado, seção 1). O projeto compreende somente o processo de recebimento, integração, validação e capacitação.</w:t>
+      </w:r>
+    </w:p>
+    <w:p>
+      <w:pPr>
+        <w:pStyle w:val="BodyText"/>
+      </w:pPr>
+      <w:r>
+        <w:rPr>
+          <w:bCs/>
+          <w:b/>
+        </w:rPr>
         <w:t xml:space="preserve">Fora da EAP por decisão do orientador (D2).</w:t>
       </w:r>
       <w:r>
         <w:t xml:space="preserve"> </w:t>
       </w:r>
       <w:r>
-        <w:t xml:space="preserve">Não integram a EAP revisada, sob nenhuma denominação: estudo de mercado; decisão de fornecimento; definição de potenciais fornecedores; comparação ou análise de propostas; estratégia de contratação; seleção de fornecedor; licitação; contratação; matriz de avaliação de fornecedor. A divergência com o texto do TAP está registrada no conflito C1 (seção IX).</w:t>
+        <w:t xml:space="preserve">Não integram a EAP revisada, sob nenhuma denominação: estudo de mercado; decisão de fornecimento; definição de potenciais fornecedores; comparação ou análise de propostas; estratégia de contratação; seleção de fornecedor; licitação; contratação; matriz de avaliação de fornecedor.</w:t>
       </w:r>
     </w:p>
     <w:p>
@@ -3355,7 +3373,7 @@
               <w:rPr>
                 <w:sz w:val="18"/>
               </w:rPr>
-              <w:t xml:space="preserve">A arquitetura modular e a configuração do MVP (antigo 3.2) e os requisitos de treinamento, sobressalentes, manutenção por 5 anos e vida útil de 10 anos (antigo 3.3) são requisitos do sistema exigidos pelo TAP (entrega 6; requisitos 1, 8, 13 e 14). Passam a integrar a linha de base de requisitos, sem qualquer elemento de mercado, seleção, contratação ou avaliação de fornecedor.</w:t>
+              <w:t xml:space="preserve">A arquitetura modular e a configuração do MVP (antigo 3.2) e os requisitos de treinamento, sobressalentes, manutenção por 5 anos e vida útil de 10 anos (antigo 3.3) são requisitos do sistema exigidos pelo TAP (entrega 5; requisitos 1, 8, 13 e 14). Passam a integrar a linha de base de requisitos, sem qualquer elemento de mercado, seleção, contratação ou avaliação de fornecedor.</w:t>
             </w:r>
           </w:p>
         </w:tc>
@@ -3487,7 +3505,7 @@
               <w:rPr>
                 <w:sz w:val="18"/>
               </w:rPr>
-              <w:t xml:space="preserve">O antigo 6.4 (Avaliação operacional piloto), já subordinado à Capacitação na EAP original, corresponde à entrega 10 e ao indicador 8.5 do TAP. Foi absorvido no pacote 4.1, denominado</w:t>
+              <w:t xml:space="preserve">O antigo 6.4 (Avaliação operacional piloto), já subordinado à Capacitação na EAP original, corresponde à entrega 9 e ao indicador 10.5 do TAP. Foi absorvido no pacote 4.1, denominado</w:t>
             </w:r>
             <w:r>
               <w:rPr>
@@ -5640,23 +5658,23 @@
               <w:rPr>
                 <w:sz w:val="18"/>
               </w:rPr>
-              <w:t xml:space="preserve">O gerenciamento está no pacote 1. Todas as entregas-chave do TAP estão cobertas (seção IX), exceto as relativas à obtenção contratual, excluídas por decisão do orientador e registradas como conflito C1.</w:t>
-            </w:r>
-          </w:p>
-        </w:tc>
-        <w:tc>
-          <w:tcPr/>
-          <w:p>
-            <w:pPr>
-              <w:pStyle w:val="Compact"/>
-              <w:spacing w:after="40"/>
-              <w:jc w:val="left"/>
-            </w:pPr>
-            <w:r>
-              <w:rPr>
-                <w:sz w:val="18"/>
-              </w:rPr>
-              <w:t xml:space="preserve">Atendido, com o registro C1</w:t>
+              <w:t xml:space="preserve">O gerenciamento está no pacote 1. Todas as entregas-chave do TAP consolidado estão cobertas (seção IX). A obtenção contratual é premissa concluída e não integra o projeto (C1 resolvido).</w:t>
+            </w:r>
+          </w:p>
+        </w:tc>
+        <w:tc>
+          <w:tcPr/>
+          <w:p>
+            <w:pPr>
+              <w:pStyle w:val="Compact"/>
+              <w:spacing w:after="40"/>
+              <w:jc w:val="left"/>
+            </w:pPr>
+            <w:r>
+              <w:rPr>
+                <w:sz w:val="18"/>
+              </w:rPr>
+              <w:t xml:space="preserve">Atendido</w:t>
             </w:r>
           </w:p>
         </w:tc>
@@ -6108,7 +6126,7 @@
               <w:rPr>
                 <w:sz w:val="18"/>
               </w:rPr>
-              <w:t xml:space="preserve">Testes subordinados ao Recebimento; encerramento ao Gerenciamento; documentação técnica e piloto à Capacitação, entendida como preparo da organização para operar e manter (TAP, objetivo 7); nenhum elemento do antigo Fornecedor.</w:t>
+              <w:t xml:space="preserve">Testes subordinados ao Recebimento; encerramento ao Gerenciamento; documentação técnica e piloto à Capacitação, entendida como preparo da organização para operar e manter (TAP, objetivo 6); nenhum elemento do antigo Fornecedor.</w:t>
             </w:r>
           </w:p>
         </w:tc>
@@ -6359,7 +6377,7 @@
       </w:r>
     </w:p>
     <w:bookmarkEnd w:id="31"/>
-    <w:bookmarkStart w:id="38" w:name="ix-validação-contra-a-tarefa-1-tap"/>
+    <w:bookmarkStart w:id="38" w:name="Xf439ab9b74cdaed40e9bc1b40ec1eed9a98fcf9"/>
     <w:p>
       <w:pPr>
         <w:pStyle w:val="Heading2"/>
@@ -6368,7 +6386,24 @@
         <w:rPr>
           <w:color w:val="0F2A4A"/>
         </w:rPr>
-        <w:t xml:space="preserve">IX — Validação contra a Tarefa 1 (TAP)</w:t>
+        <w:t xml:space="preserve">IX — Validação contra a Tarefa 1 (TAP consolidado)</w:t>
+      </w:r>
+    </w:p>
+    <w:p>
+      <w:pPr>
+        <w:pStyle w:val="FirstParagraph"/>
+      </w:pPr>
+      <w:r>
+        <w:t xml:space="preserve">A validação usa o TAP consolidado (</w:t>
+      </w:r>
+      <w:r>
+        <w:rPr>
+          <w:rStyle w:val="VerbatimChar"/>
+        </w:rPr>
+        <w:t xml:space="preserve">tarefa-1-revisada.md</w:t>
+      </w:r>
+      <w:r>
+        <w:t xml:space="preserve">), que incorpora a premissa de obtenção contratual concluída (conflito C1 resolvido). A numeração abaixo é a do TAP consolidado.</w:t>
       </w:r>
     </w:p>
     <w:bookmarkStart w:id="32" w:name="entregas-chave-do-tap-seção-4"/>
@@ -6782,39 +6817,39 @@
               <w:rPr>
                 <w:sz w:val="18"/>
               </w:rPr>
-              <w:t xml:space="preserve">Estudo de mercado e análise das alternativas de fornecimento, incluindo soluções comerciais, adaptação, cadeia nacional e custo total de propriedade;</w:t>
-            </w:r>
-          </w:p>
-        </w:tc>
-        <w:tc>
-          <w:tcPr/>
-          <w:p>
-            <w:pPr>
-              <w:pStyle w:val="Compact"/>
-              <w:spacing w:after="40"/>
-              <w:jc w:val="left"/>
-            </w:pPr>
-            <w:r>
-              <w:rPr>
-                <w:sz w:val="18"/>
-              </w:rPr>
-              <w:t xml:space="preserve">—</w:t>
-            </w:r>
-          </w:p>
-        </w:tc>
-        <w:tc>
-          <w:tcPr/>
-          <w:p>
-            <w:pPr>
-              <w:pStyle w:val="Compact"/>
-              <w:spacing w:after="40"/>
-              <w:jc w:val="left"/>
-            </w:pPr>
-            <w:r>
-              <w:rPr>
-                <w:sz w:val="18"/>
-              </w:rPr>
-              <w:t xml:space="preserve">Fora da EAP por decisão do orientador (C1)</w:t>
+              <w:t xml:space="preserve">Arquitetura modular e especificação técnica, contemplando núcleo, interfaces, configuração do MVP, umbilical, gestão dinâmica e estados seguros;</w:t>
+            </w:r>
+          </w:p>
+        </w:tc>
+        <w:tc>
+          <w:tcPr/>
+          <w:p>
+            <w:pPr>
+              <w:pStyle w:val="Compact"/>
+              <w:spacing w:after="40"/>
+              <w:jc w:val="left"/>
+            </w:pPr>
+            <w:r>
+              <w:rPr>
+                <w:sz w:val="18"/>
+              </w:rPr>
+              <w:t xml:space="preserve">2 (definição); 3.1 (verificação)</w:t>
+            </w:r>
+          </w:p>
+        </w:tc>
+        <w:tc>
+          <w:tcPr/>
+          <w:p>
+            <w:pPr>
+              <w:pStyle w:val="Compact"/>
+              <w:spacing w:after="40"/>
+              <w:jc w:val="left"/>
+            </w:pPr>
+            <w:r>
+              <w:rPr>
+                <w:sz w:val="18"/>
+              </w:rPr>
+              <w:t xml:space="preserve">Coberta</w:t>
             </w:r>
           </w:p>
         </w:tc>
@@ -6848,23 +6883,23 @@
               <w:rPr>
                 <w:sz w:val="18"/>
               </w:rPr>
-              <w:t xml:space="preserve">Arquitetura modular e especificação técnica, contemplando núcleo, interfaces, configuração do MVP, umbilical, gestão dinâmica e estados seguros;</w:t>
-            </w:r>
-          </w:p>
-        </w:tc>
-        <w:tc>
-          <w:tcPr/>
-          <w:p>
-            <w:pPr>
-              <w:pStyle w:val="Compact"/>
-              <w:spacing w:after="40"/>
-              <w:jc w:val="left"/>
-            </w:pPr>
-            <w:r>
-              <w:rPr>
-                <w:sz w:val="18"/>
-              </w:rPr>
-              <w:t xml:space="preserve">2 (definição); 3.1 (verificação)</w:t>
+              <w:t xml:space="preserve">ROV recebido, integrado e configurado conforme a configuração aprovada;</w:t>
+            </w:r>
+          </w:p>
+        </w:tc>
+        <w:tc>
+          <w:tcPr/>
+          <w:p>
+            <w:pPr>
+              <w:pStyle w:val="Compact"/>
+              <w:spacing w:after="40"/>
+              <w:jc w:val="left"/>
+            </w:pPr>
+            <w:r>
+              <w:rPr>
+                <w:sz w:val="18"/>
+              </w:rPr>
+              <w:t xml:space="preserve">3 (recebido, integrado e configurado)</w:t>
             </w:r>
           </w:p>
         </w:tc>
@@ -6914,75 +6949,39 @@
               <w:rPr>
                 <w:sz w:val="18"/>
               </w:rPr>
-              <w:t xml:space="preserve">ROV adquirido, recebido, integrado e configurado conforme a solução aprovada;</w:t>
-            </w:r>
-          </w:p>
-        </w:tc>
-        <w:tc>
-          <w:tcPr/>
-          <w:p>
-            <w:pPr>
-              <w:pStyle w:val="Compact"/>
-              <w:spacing w:after="40"/>
-              <w:jc w:val="left"/>
-            </w:pPr>
-            <w:r>
-              <w:rPr>
-                <w:sz w:val="18"/>
-              </w:rPr>
-              <w:t xml:space="preserve">3 (recebido, integrado e configurado)</w:t>
-            </w:r>
-          </w:p>
-        </w:tc>
-        <w:tc>
-          <w:tcPr/>
-          <w:p>
-            <w:pPr>
-              <w:pStyle w:val="Compact"/>
-              <w:spacing w:after="40"/>
-              <w:jc w:val="left"/>
-            </w:pPr>
-            <w:r>
-              <w:rPr>
-                <w:sz w:val="18"/>
-              </w:rPr>
-              <w:t xml:space="preserve">Coberta, exceto</w:t>
-            </w:r>
-            <w:r>
-              <w:rPr>
-                <w:sz w:val="18"/>
-              </w:rPr>
-              <w:t xml:space="preserve"> </w:t>
-            </w:r>
-            <w:r>
-              <w:rPr>
-                <w:sz w:val="18"/>
-              </w:rPr>
-              <w:t xml:space="preserve">“</w:t>
-            </w:r>
-            <w:r>
-              <w:rPr>
-                <w:sz w:val="18"/>
-              </w:rPr>
-              <w:t xml:space="preserve">adquirido</w:t>
-            </w:r>
-            <w:r>
-              <w:rPr>
-                <w:sz w:val="18"/>
-              </w:rPr>
-              <w:t xml:space="preserve">”</w:t>
-            </w:r>
-            <w:r>
-              <w:rPr>
-                <w:sz w:val="18"/>
-              </w:rPr>
-              <w:t xml:space="preserve"> </w:t>
-            </w:r>
-            <w:r>
-              <w:rPr>
-                <w:sz w:val="18"/>
-              </w:rPr>
-              <w:t xml:space="preserve">(C1)</w:t>
+              <w:t xml:space="preserve">Plano, procedimentos e evidências de testes de bancada, água doce e água salgada;</w:t>
+            </w:r>
+          </w:p>
+        </w:tc>
+        <w:tc>
+          <w:tcPr/>
+          <w:p>
+            <w:pPr>
+              <w:pStyle w:val="Compact"/>
+              <w:spacing w:after="40"/>
+              <w:jc w:val="left"/>
+            </w:pPr>
+            <w:r>
+              <w:rPr>
+                <w:sz w:val="18"/>
+              </w:rPr>
+              <w:t xml:space="preserve">3.3 (plano e procedimentos); 3.1 e 3.2 (evidências)</w:t>
+            </w:r>
+          </w:p>
+        </w:tc>
+        <w:tc>
+          <w:tcPr/>
+          <w:p>
+            <w:pPr>
+              <w:pStyle w:val="Compact"/>
+              <w:spacing w:after="40"/>
+              <w:jc w:val="left"/>
+            </w:pPr>
+            <w:r>
+              <w:rPr>
+                <w:sz w:val="18"/>
+              </w:rPr>
+              <w:t xml:space="preserve">Coberta</w:t>
             </w:r>
           </w:p>
         </w:tc>
@@ -7016,23 +7015,23 @@
               <w:rPr>
                 <w:sz w:val="18"/>
               </w:rPr>
-              <w:t xml:space="preserve">Plano, procedimentos e evidências de testes de bancada, água doce e água salgada;</w:t>
-            </w:r>
-          </w:p>
-        </w:tc>
-        <w:tc>
-          <w:tcPr/>
-          <w:p>
-            <w:pPr>
-              <w:pStyle w:val="Compact"/>
-              <w:spacing w:after="40"/>
-              <w:jc w:val="left"/>
-            </w:pPr>
-            <w:r>
-              <w:rPr>
-                <w:sz w:val="18"/>
-              </w:rPr>
-              <w:t xml:space="preserve">3.3 (plano e procedimentos); 3.1 e 3.2 (evidências)</w:t>
+              <w:t xml:space="preserve">Capacitação, documentação, sobressalentes e plano de manutenção;</w:t>
+            </w:r>
+          </w:p>
+        </w:tc>
+        <w:tc>
+          <w:tcPr/>
+          <w:p>
+            <w:pPr>
+              <w:pStyle w:val="Compact"/>
+              <w:spacing w:after="40"/>
+              <w:jc w:val="left"/>
+            </w:pPr>
+            <w:r>
+              <w:rPr>
+                <w:sz w:val="18"/>
+              </w:rPr>
+              <w:t xml:space="preserve">4.1 (capacitação); 4.2 (documentação e plano de manutenção); 3.4 (sobressalentes)</w:t>
             </w:r>
           </w:p>
         </w:tc>
@@ -7082,23 +7081,23 @@
               <w:rPr>
                 <w:sz w:val="18"/>
               </w:rPr>
-              <w:t xml:space="preserve">Capacitação, documentação, sobressalentes e plano de manutenção;</w:t>
-            </w:r>
-          </w:p>
-        </w:tc>
-        <w:tc>
-          <w:tcPr/>
-          <w:p>
-            <w:pPr>
-              <w:pStyle w:val="Compact"/>
-              <w:spacing w:after="40"/>
-              <w:jc w:val="left"/>
-            </w:pPr>
-            <w:r>
-              <w:rPr>
-                <w:sz w:val="18"/>
-              </w:rPr>
-              <w:t xml:space="preserve">4.1 (capacitação); 4.2 (documentação e plano de manutenção); 3.4 (sobressalentes)</w:t>
+              <w:t xml:space="preserve">Piloto operacional e relatório de avaliação dos resultados, desempenho, limites e benefícios;</w:t>
+            </w:r>
+          </w:p>
+        </w:tc>
+        <w:tc>
+          <w:tcPr/>
+          <w:p>
+            <w:pPr>
+              <w:pStyle w:val="Compact"/>
+              <w:spacing w:after="40"/>
+              <w:jc w:val="left"/>
+            </w:pPr>
+            <w:r>
+              <w:rPr>
+                <w:sz w:val="18"/>
+              </w:rPr>
+              <w:t xml:space="preserve">4.1</w:t>
             </w:r>
           </w:p>
         </w:tc>
@@ -7133,72 +7132,6 @@
                 <w:sz w:val="18"/>
               </w:rPr>
               <w:t xml:space="preserve">10</w:t>
-            </w:r>
-          </w:p>
-        </w:tc>
-        <w:tc>
-          <w:tcPr/>
-          <w:p>
-            <w:pPr>
-              <w:pStyle w:val="Compact"/>
-              <w:spacing w:after="40"/>
-              <w:jc w:val="left"/>
-            </w:pPr>
-            <w:r>
-              <w:rPr>
-                <w:sz w:val="18"/>
-              </w:rPr>
-              <w:t xml:space="preserve">Piloto operacional e relatório de avaliação dos resultados, desempenho, limites e benefícios;</w:t>
-            </w:r>
-          </w:p>
-        </w:tc>
-        <w:tc>
-          <w:tcPr/>
-          <w:p>
-            <w:pPr>
-              <w:pStyle w:val="Compact"/>
-              <w:spacing w:after="40"/>
-              <w:jc w:val="left"/>
-            </w:pPr>
-            <w:r>
-              <w:rPr>
-                <w:sz w:val="18"/>
-              </w:rPr>
-              <w:t xml:space="preserve">4.1</w:t>
-            </w:r>
-          </w:p>
-        </w:tc>
-        <w:tc>
-          <w:tcPr/>
-          <w:p>
-            <w:pPr>
-              <w:pStyle w:val="Compact"/>
-              <w:spacing w:after="40"/>
-              <w:jc w:val="left"/>
-            </w:pPr>
-            <w:r>
-              <w:rPr>
-                <w:sz w:val="18"/>
-              </w:rPr>
-              <w:t xml:space="preserve">Coberta</w:t>
-            </w:r>
-          </w:p>
-        </w:tc>
-      </w:tr>
-      <w:tr>
-        <w:tc>
-          <w:tcPr/>
-          <w:p>
-            <w:pPr>
-              <w:pStyle w:val="Compact"/>
-              <w:spacing w:after="40"/>
-              <w:jc w:val="left"/>
-            </w:pPr>
-            <w:r>
-              <w:rPr>
-                <w:sz w:val="18"/>
-              </w:rPr>
-              <w:t xml:space="preserve">11</w:t>
             </w:r>
           </w:p>
         </w:tc>
@@ -7466,39 +7399,39 @@
               <w:rPr>
                 <w:sz w:val="18"/>
               </w:rPr>
-              <w:t xml:space="preserve">Definir a solução comercial ou adaptada mais adequada (T0 + 4 meses)</w:t>
-            </w:r>
-          </w:p>
-        </w:tc>
-        <w:tc>
-          <w:tcPr/>
-          <w:p>
-            <w:pPr>
-              <w:pStyle w:val="Compact"/>
-              <w:spacing w:after="40"/>
-              <w:jc w:val="left"/>
-            </w:pPr>
-            <w:r>
-              <w:rPr>
-                <w:sz w:val="18"/>
-              </w:rPr>
-              <w:t xml:space="preserve">—</w:t>
-            </w:r>
-          </w:p>
-        </w:tc>
-        <w:tc>
-          <w:tcPr/>
-          <w:p>
-            <w:pPr>
-              <w:pStyle w:val="Compact"/>
-              <w:spacing w:after="40"/>
-              <w:jc w:val="left"/>
-            </w:pPr>
-            <w:r>
-              <w:rPr>
-                <w:sz w:val="18"/>
-              </w:rPr>
-              <w:t xml:space="preserve">Fora da EAP por decisão do orientador (C1)</w:t>
+              <w:t xml:space="preserve">Receber a configuração inicial do MVP (T0 + 12 meses)</w:t>
+            </w:r>
+          </w:p>
+        </w:tc>
+        <w:tc>
+          <w:tcPr/>
+          <w:p>
+            <w:pPr>
+              <w:pStyle w:val="Compact"/>
+              <w:spacing w:after="40"/>
+              <w:jc w:val="left"/>
+            </w:pPr>
+            <w:r>
+              <w:rPr>
+                <w:sz w:val="18"/>
+              </w:rPr>
+              <w:t xml:space="preserve">3 (recebimento)</w:t>
+            </w:r>
+          </w:p>
+        </w:tc>
+        <w:tc>
+          <w:tcPr/>
+          <w:p>
+            <w:pPr>
+              <w:pStyle w:val="Compact"/>
+              <w:spacing w:after="40"/>
+              <w:jc w:val="left"/>
+            </w:pPr>
+            <w:r>
+              <w:rPr>
+                <w:sz w:val="18"/>
+              </w:rPr>
+              <w:t xml:space="preserve">Coberto</w:t>
             </w:r>
           </w:p>
         </w:tc>
@@ -7532,39 +7465,39 @@
               <w:rPr>
                 <w:sz w:val="18"/>
               </w:rPr>
-              <w:t xml:space="preserve">Adquirir e receber a configuração inicial do MVP (T0 + 12 meses)</w:t>
-            </w:r>
-          </w:p>
-        </w:tc>
-        <w:tc>
-          <w:tcPr/>
-          <w:p>
-            <w:pPr>
-              <w:pStyle w:val="Compact"/>
-              <w:spacing w:after="40"/>
-              <w:jc w:val="left"/>
-            </w:pPr>
-            <w:r>
-              <w:rPr>
-                <w:sz w:val="18"/>
-              </w:rPr>
-              <w:t xml:space="preserve">3 (recebimento)</w:t>
-            </w:r>
-          </w:p>
-        </w:tc>
-        <w:tc>
-          <w:tcPr/>
-          <w:p>
-            <w:pPr>
-              <w:pStyle w:val="Compact"/>
-              <w:spacing w:after="40"/>
-              <w:jc w:val="left"/>
-            </w:pPr>
-            <w:r>
-              <w:rPr>
-                <w:sz w:val="18"/>
-              </w:rPr>
-              <w:t xml:space="preserve">Coberto, exceto a aquisição (C1)</w:t>
+              <w:t xml:space="preserve">Demonstrar operação segura por uma pessoa treinada</w:t>
+            </w:r>
+          </w:p>
+        </w:tc>
+        <w:tc>
+          <w:tcPr/>
+          <w:p>
+            <w:pPr>
+              <w:pStyle w:val="Compact"/>
+              <w:spacing w:after="40"/>
+              <w:jc w:val="left"/>
+            </w:pPr>
+            <w:r>
+              <w:rPr>
+                <w:sz w:val="18"/>
+              </w:rPr>
+              <w:t xml:space="preserve">3.2; 4.1</w:t>
+            </w:r>
+          </w:p>
+        </w:tc>
+        <w:tc>
+          <w:tcPr/>
+          <w:p>
+            <w:pPr>
+              <w:pStyle w:val="Compact"/>
+              <w:spacing w:after="40"/>
+              <w:jc w:val="left"/>
+            </w:pPr>
+            <w:r>
+              <w:rPr>
+                <w:sz w:val="18"/>
+              </w:rPr>
+              <w:t xml:space="preserve">Coberto</w:t>
             </w:r>
           </w:p>
         </w:tc>
@@ -7598,23 +7531,23 @@
               <w:rPr>
                 <w:sz w:val="18"/>
               </w:rPr>
-              <w:t xml:space="preserve">Demonstrar operação segura por uma pessoa treinada</w:t>
-            </w:r>
-          </w:p>
-        </w:tc>
-        <w:tc>
-          <w:tcPr/>
-          <w:p>
-            <w:pPr>
-              <w:pStyle w:val="Compact"/>
-              <w:spacing w:after="40"/>
-              <w:jc w:val="left"/>
-            </w:pPr>
-            <w:r>
-              <w:rPr>
-                <w:sz w:val="18"/>
-              </w:rPr>
-              <w:t xml:space="preserve">3.2; 4.1</w:t>
+              <w:t xml:space="preserve">Demonstrar o envelope operacional aprovado (10 m nominal / 30 m máximo)</w:t>
+            </w:r>
+          </w:p>
+        </w:tc>
+        <w:tc>
+          <w:tcPr/>
+          <w:p>
+            <w:pPr>
+              <w:pStyle w:val="Compact"/>
+              <w:spacing w:after="40"/>
+              <w:jc w:val="left"/>
+            </w:pPr>
+            <w:r>
+              <w:rPr>
+                <w:sz w:val="18"/>
+              </w:rPr>
+              <w:t xml:space="preserve">3.2</w:t>
             </w:r>
           </w:p>
         </w:tc>
@@ -7664,23 +7597,23 @@
               <w:rPr>
                 <w:sz w:val="18"/>
               </w:rPr>
-              <w:t xml:space="preserve">Demonstrar o envelope operacional aprovado (10 m nominal / 30 m máximo)</w:t>
-            </w:r>
-          </w:p>
-        </w:tc>
-        <w:tc>
-          <w:tcPr/>
-          <w:p>
-            <w:pPr>
-              <w:pStyle w:val="Compact"/>
-              <w:spacing w:after="40"/>
-              <w:jc w:val="left"/>
-            </w:pPr>
-            <w:r>
-              <w:rPr>
-                <w:sz w:val="18"/>
-              </w:rPr>
-              <w:t xml:space="preserve">3.2</w:t>
+              <w:t xml:space="preserve">Demonstrar autonomia mínima de 2h30 e registro de imagem (1080p/30fps e 4K/15fps)</w:t>
+            </w:r>
+          </w:p>
+        </w:tc>
+        <w:tc>
+          <w:tcPr/>
+          <w:p>
+            <w:pPr>
+              <w:pStyle w:val="Compact"/>
+              <w:spacing w:after="40"/>
+              <w:jc w:val="left"/>
+            </w:pPr>
+            <w:r>
+              <w:rPr>
+                <w:sz w:val="18"/>
+              </w:rPr>
+              <w:t xml:space="preserve">3.1</w:t>
             </w:r>
           </w:p>
         </w:tc>
@@ -7730,23 +7663,23 @@
               <w:rPr>
                 <w:sz w:val="18"/>
               </w:rPr>
-              <w:t xml:space="preserve">Demonstrar autonomia mínima de 2h30 e registro de imagem (1080p/30fps e 4K/15fps)</w:t>
-            </w:r>
-          </w:p>
-        </w:tc>
-        <w:tc>
-          <w:tcPr/>
-          <w:p>
-            <w:pPr>
-              <w:pStyle w:val="Compact"/>
-              <w:spacing w:after="40"/>
-              <w:jc w:val="left"/>
-            </w:pPr>
-            <w:r>
-              <w:rPr>
-                <w:sz w:val="18"/>
-              </w:rPr>
-              <w:t xml:space="preserve">3.1</w:t>
+              <w:t xml:space="preserve">Preparar a organização para operar e manter a configuração inicial</w:t>
+            </w:r>
+          </w:p>
+        </w:tc>
+        <w:tc>
+          <w:tcPr/>
+          <w:p>
+            <w:pPr>
+              <w:pStyle w:val="Compact"/>
+              <w:spacing w:after="40"/>
+              <w:jc w:val="left"/>
+            </w:pPr>
+            <w:r>
+              <w:rPr>
+                <w:sz w:val="18"/>
+              </w:rPr>
+              <w:t xml:space="preserve">4 (4.1 e 4.2); 3.4</w:t>
             </w:r>
           </w:p>
         </w:tc>
@@ -7781,72 +7714,6 @@
                 <w:sz w:val="18"/>
               </w:rPr>
               <w:t xml:space="preserve">7</w:t>
-            </w:r>
-          </w:p>
-        </w:tc>
-        <w:tc>
-          <w:tcPr/>
-          <w:p>
-            <w:pPr>
-              <w:pStyle w:val="Compact"/>
-              <w:spacing w:after="40"/>
-              <w:jc w:val="left"/>
-            </w:pPr>
-            <w:r>
-              <w:rPr>
-                <w:sz w:val="18"/>
-              </w:rPr>
-              <w:t xml:space="preserve">Preparar a organização para operar e manter a configuração inicial</w:t>
-            </w:r>
-          </w:p>
-        </w:tc>
-        <w:tc>
-          <w:tcPr/>
-          <w:p>
-            <w:pPr>
-              <w:pStyle w:val="Compact"/>
-              <w:spacing w:after="40"/>
-              <w:jc w:val="left"/>
-            </w:pPr>
-            <w:r>
-              <w:rPr>
-                <w:sz w:val="18"/>
-              </w:rPr>
-              <w:t xml:space="preserve">4 (4.1 e 4.2); 3.4</w:t>
-            </w:r>
-          </w:p>
-        </w:tc>
-        <w:tc>
-          <w:tcPr/>
-          <w:p>
-            <w:pPr>
-              <w:pStyle w:val="Compact"/>
-              <w:spacing w:after="40"/>
-              <w:jc w:val="left"/>
-            </w:pPr>
-            <w:r>
-              <w:rPr>
-                <w:sz w:val="18"/>
-              </w:rPr>
-              <w:t xml:space="preserve">Coberto</w:t>
-            </w:r>
-          </w:p>
-        </w:tc>
-      </w:tr>
-      <w:tr>
-        <w:tc>
-          <w:tcPr/>
-          <w:p>
-            <w:pPr>
-              <w:pStyle w:val="Compact"/>
-              <w:spacing w:after="40"/>
-              <w:jc w:val="left"/>
-            </w:pPr>
-            <w:r>
-              <w:rPr>
-                <w:sz w:val="18"/>
-              </w:rPr>
-              <w:t xml:space="preserve">8</w:t>
             </w:r>
           </w:p>
         </w:tc>
@@ -9064,39 +8931,39 @@
               <w:rPr>
                 <w:sz w:val="18"/>
               </w:rPr>
-              <w:t xml:space="preserve">Cadeia nacional</w:t>
-            </w:r>
-          </w:p>
-        </w:tc>
-        <w:tc>
-          <w:tcPr/>
-          <w:p>
-            <w:pPr>
-              <w:pStyle w:val="Compact"/>
-              <w:spacing w:after="40"/>
-              <w:jc w:val="left"/>
-            </w:pPr>
-            <w:r>
-              <w:rPr>
-                <w:sz w:val="18"/>
-              </w:rPr>
-              <w:t xml:space="preserve">— (C1)</w:t>
-            </w:r>
-          </w:p>
-        </w:tc>
-        <w:tc>
-          <w:tcPr/>
-          <w:p>
-            <w:pPr>
-              <w:pStyle w:val="Compact"/>
-              <w:spacing w:after="40"/>
-              <w:jc w:val="left"/>
-            </w:pPr>
-            <w:r>
-              <w:rPr>
-                <w:sz w:val="18"/>
-              </w:rPr>
-              <w:t xml:space="preserve">Não rastreado — obtenção contratual fora da EAP</w:t>
+              <w:t xml:space="preserve">Resultados do MVP</w:t>
+            </w:r>
+          </w:p>
+        </w:tc>
+        <w:tc>
+          <w:tcPr/>
+          <w:p>
+            <w:pPr>
+              <w:pStyle w:val="Compact"/>
+              <w:spacing w:after="40"/>
+              <w:jc w:val="left"/>
+            </w:pPr>
+            <w:r>
+              <w:rPr>
+                <w:sz w:val="18"/>
+              </w:rPr>
+              <w:t xml:space="preserve">3.2</w:t>
+            </w:r>
+          </w:p>
+        </w:tc>
+        <w:tc>
+          <w:tcPr/>
+          <w:p>
+            <w:pPr>
+              <w:pStyle w:val="Compact"/>
+              <w:spacing w:after="40"/>
+              <w:jc w:val="left"/>
+            </w:pPr>
+            <w:r>
+              <w:rPr>
+                <w:sz w:val="18"/>
+              </w:rPr>
+              <w:t xml:space="preserve">RQ-20</w:t>
             </w:r>
           </w:p>
         </w:tc>
@@ -9115,72 +8982,6 @@
                 <w:sz w:val="18"/>
               </w:rPr>
               <w:t xml:space="preserve">17</w:t>
-            </w:r>
-          </w:p>
-        </w:tc>
-        <w:tc>
-          <w:tcPr/>
-          <w:p>
-            <w:pPr>
-              <w:pStyle w:val="Compact"/>
-              <w:spacing w:after="40"/>
-              <w:jc w:val="left"/>
-            </w:pPr>
-            <w:r>
-              <w:rPr>
-                <w:sz w:val="18"/>
-              </w:rPr>
-              <w:t xml:space="preserve">Resultados do MVP</w:t>
-            </w:r>
-          </w:p>
-        </w:tc>
-        <w:tc>
-          <w:tcPr/>
-          <w:p>
-            <w:pPr>
-              <w:pStyle w:val="Compact"/>
-              <w:spacing w:after="40"/>
-              <w:jc w:val="left"/>
-            </w:pPr>
-            <w:r>
-              <w:rPr>
-                <w:sz w:val="18"/>
-              </w:rPr>
-              <w:t xml:space="preserve">3.2</w:t>
-            </w:r>
-          </w:p>
-        </w:tc>
-        <w:tc>
-          <w:tcPr/>
-          <w:p>
-            <w:pPr>
-              <w:pStyle w:val="Compact"/>
-              <w:spacing w:after="40"/>
-              <w:jc w:val="left"/>
-            </w:pPr>
-            <w:r>
-              <w:rPr>
-                <w:sz w:val="18"/>
-              </w:rPr>
-              <w:t xml:space="preserve">RQ-20</w:t>
-            </w:r>
-          </w:p>
-        </w:tc>
-      </w:tr>
-      <w:tr>
-        <w:tc>
-          <w:tcPr/>
-          <w:p>
-            <w:pPr>
-              <w:pStyle w:val="Compact"/>
-              <w:spacing w:after="40"/>
-              <w:jc w:val="left"/>
-            </w:pPr>
-            <w:r>
-              <w:rPr>
-                <w:sz w:val="18"/>
-              </w:rPr>
-              <w:t xml:space="preserve">18</w:t>
             </w:r>
           </w:p>
         </w:tc>
@@ -9844,7 +9645,7 @@
               <w:rPr>
                 <w:sz w:val="18"/>
               </w:rPr>
-              <w:t xml:space="preserve">O orçamento ainda não está pré-aprovado e deverá incorporar aquisição, suporte, sobressalentes, treinamento e ciclo de vida; e</w:t>
+              <w:t xml:space="preserve">O orçamento ainda não está pré-aprovado e deverá incorporar suporte, sobressalentes, treinamento e ciclo de vida; e</w:t>
             </w:r>
           </w:p>
         </w:tc>
@@ -9910,7 +9711,7 @@
               <w:rPr>
                 <w:sz w:val="18"/>
               </w:rPr>
-              <w:t xml:space="preserve">A aprovação de requisitos, solução, testes e recebimento dependerá da Força de Submarinos.</w:t>
+              <w:t xml:space="preserve">A aprovação de requisitos, testes e recebimento dependerá da Força de Submarinos.</w:t>
             </w:r>
           </w:p>
         </w:tc>
@@ -9942,37 +9743,7 @@
               <w:rPr>
                 <w:sz w:val="18"/>
               </w:rPr>
-              <w:t xml:space="preserve">Respeitada (aprovação da</w:t>
-            </w:r>
-            <w:r>
-              <w:rPr>
-                <w:sz w:val="18"/>
-              </w:rPr>
-              <w:t xml:space="preserve"> </w:t>
-            </w:r>
-            <w:r>
-              <w:rPr>
-                <w:sz w:val="18"/>
-              </w:rPr>
-              <w:t xml:space="preserve">“</w:t>
-            </w:r>
-            <w:r>
-              <w:rPr>
-                <w:sz w:val="18"/>
-              </w:rPr>
-              <w:t xml:space="preserve">solução</w:t>
-            </w:r>
-            <w:r>
-              <w:rPr>
-                <w:sz w:val="18"/>
-              </w:rPr>
-              <w:t xml:space="preserve">”</w:t>
-            </w:r>
-            <w:r>
-              <w:rPr>
-                <w:sz w:val="18"/>
-              </w:rPr>
-              <w:t xml:space="preserve">: ver C1)</w:t>
+              <w:t xml:space="preserve">Respeitada</w:t>
             </w:r>
           </w:p>
         </w:tc>
@@ -9996,43 +9767,7 @@
         <w:pStyle w:val="FirstParagraph"/>
       </w:pPr>
       <w:r>
-        <w:t xml:space="preserve">As partes interessadas permanecem as do TAP (seção 8), sem acréscimos. A EAP não cria pacotes por parte interessada.</w:t>
-      </w:r>
-      <w:r>
-        <w:t xml:space="preserve"> </w:t>
-      </w:r>
-      <w:r>
-        <w:t xml:space="preserve">“</w:t>
-      </w:r>
-      <w:r>
-        <w:t xml:space="preserve">Setores de aquisição e assessoria jurídica</w:t>
-      </w:r>
-      <w:r>
-        <w:t xml:space="preserve">”</w:t>
-      </w:r>
-      <w:r>
-        <w:t xml:space="preserve"> </w:t>
-      </w:r>
-      <w:r>
-        <w:t xml:space="preserve">e</w:t>
-      </w:r>
-      <w:r>
-        <w:t xml:space="preserve"> </w:t>
-      </w:r>
-      <w:r>
-        <w:t xml:space="preserve">“</w:t>
-      </w:r>
-      <w:r>
-        <w:t xml:space="preserve">Fornecedores nacionais e integradores</w:t>
-      </w:r>
-      <w:r>
-        <w:t xml:space="preserve">”</w:t>
-      </w:r>
-      <w:r>
-        <w:t xml:space="preserve"> </w:t>
-      </w:r>
-      <w:r>
-        <w:t xml:space="preserve">continuam registrados no TAP, mas não originam pacotes nem requisitos rastreados, pois a obtenção contratual está fora da EAP revisada (C1).</w:t>
+        <w:t xml:space="preserve">As partes interessadas são as do TAP consolidado (seção 8), sem acréscimos. A EAP não cria pacotes por parte interessada. A empresa responsável pelo sistema ROV participa do TAF (3.1), realizado em suas instalações, e das entregas de cursos, documentação e sobressalentes previstas no requisito 13.</w:t>
       </w:r>
     </w:p>
     <w:bookmarkEnd w:id="36"/>
@@ -10079,7 +9814,7 @@
         <w:t xml:space="preserve"> </w:t>
       </w:r>
       <w:r>
-        <w:t xml:space="preserve">· Aberto — depende de alteração da fonte (Tarefa 1)</w:t>
+        <w:t xml:space="preserve">· Resolvido — TAP consolidado</w:t>
       </w:r>
     </w:p>
     <w:p>
@@ -10101,7 +9836,7 @@
         <w:t xml:space="preserve"> </w:t>
       </w:r>
       <w:r>
-        <w:t xml:space="preserve">TAP: seção 1 (</w:t>
+        <w:t xml:space="preserve">Versão original do TAP: seção 1 (</w:t>
       </w:r>
       <w:r>
         <w:t xml:space="preserve">“</w:t>
@@ -10116,46 +9851,7 @@
         <w:t xml:space="preserve"> </w:t>
       </w:r>
       <w:r>
-        <w:t xml:space="preserve">e estratégia de aquisição de solução comercial); seção 2, objetivo 2 e parte do objetivo 3; seção 3, requisito 16; seção 4, entrega 5 e parte da entrega 7 (</w:t>
-      </w:r>
-      <w:r>
-        <w:t xml:space="preserve">“</w:t>
-      </w:r>
-      <w:r>
-        <w:t xml:space="preserve">adquirido</w:t>
-      </w:r>
-      <w:r>
-        <w:t xml:space="preserve">”</w:t>
-      </w:r>
-      <w:r>
-        <w:t xml:space="preserve">); seção 11, marcos M-04, M-06 e parte de M-05 (</w:t>
-      </w:r>
-      <w:r>
-        <w:t xml:space="preserve">“</w:t>
-      </w:r>
-      <w:r>
-        <w:t xml:space="preserve">estratégia de fornecimento</w:t>
-      </w:r>
-      <w:r>
-        <w:t xml:space="preserve">”</w:t>
-      </w:r>
-      <w:r>
-        <w:t xml:space="preserve">); seção 13 (aprovação da</w:t>
-      </w:r>
-      <w:r>
-        <w:t xml:space="preserve"> </w:t>
-      </w:r>
-      <w:r>
-        <w:t xml:space="preserve">“</w:t>
-      </w:r>
-      <w:r>
-        <w:t xml:space="preserve">estratégia de fornecimento</w:t>
-      </w:r>
-      <w:r>
-        <w:t xml:space="preserve">”</w:t>
-      </w:r>
-      <w:r>
-        <w:t xml:space="preserve">).</w:t>
+        <w:t xml:space="preserve">e estratégia de aquisição); seção 2, objetivos 2 e 3; seção 3, requisitos 13 e 16; seção 4, entregas 5 e 7; seções 5 a 9 (referências a aquisição, contrato e fornecedores); seção 11, marcos M-04 a M-06; seções 12 a 15.</w:t>
       </w:r>
     </w:p>
     <w:p>
@@ -10177,7 +9873,7 @@
         <w:t xml:space="preserve"> </w:t>
       </w:r>
       <w:r>
-        <w:t xml:space="preserve">Por decisão do orientador (D2), a EAP revisada não contém esses elementos. O texto do TAP, entretanto, continua a descrevê-los como parte do projeto.</w:t>
+        <w:t xml:space="preserve">A EAP revisada não contém elementos de obtenção contratual (decisão D2), mas a versão original do TAP os descrevia como parte do projeto.</w:t>
       </w:r>
     </w:p>
     <w:p>
@@ -10199,7 +9895,7 @@
         <w:t xml:space="preserve"> </w:t>
       </w:r>
       <w:r>
-        <w:t xml:space="preserve">O próprio TAP (seção 14) estabelece que a aprovação do projeto não representa, por si só, autorização para contratação ou aquisição, que devem observar as aprovações institucionais aplicáveis. Isso permite tratar a obtenção contratual como interface externa à EAP, mas não elimina a divergência textual.</w:t>
+        <w:t xml:space="preserve">Decisão do responsável pelo projeto: não há nada contratual no projeto; a obtenção contratual (pesquisa de mercado, definição da solução e contratação) é considerada já realizada, e o projeto compreende somente o processo de recebimento, integração, validação e capacitação.</w:t>
       </w:r>
     </w:p>
     <w:p>
@@ -10221,7 +9917,7 @@
         <w:t xml:space="preserve"> </w:t>
       </w:r>
       <w:r>
-        <w:t xml:space="preserve">TAP preservado sem alteração. Proposta de alteração de consistência do TAP, a submeter pelo controle integrado de mudanças (pacote 1) à aprovação da Força de Submarinos: (a) registrar a obtenção contratual como processo institucional externo ao escopo da EAP; (b) ajustar o objetivo 2, as entregas 5 e 7, os marcos M-04 a M-06 e a seção 13; (c) reavaliar o requisito 16, que, na redação atual, é critério de seleção de fornecedor. Na Tarefa 3, o requisito 16 não é rastreado a pacote da EAP.</w:t>
+        <w:t xml:space="preserve">TAP consolidado em entregas/tarefa-1-revisada.md, com premissa explícita e registro das alterações A1 a A25; versão original preservada em tarefas/Tarefa 01 - TAP.docx. Com a supressão do antigo requisito 16, os 17 requisitos de alto nível do TAP consolidado são todos rastreados na Tarefa 3.</w:t>
       </w:r>
     </w:p>
     <w:p>
@@ -10233,7 +9929,7 @@
           <w:bCs/>
           <w:b/>
         </w:rPr>
-        <w:t xml:space="preserve">C2 — Sequência dos marcos M-07 a M-09</w:t>
+        <w:t xml:space="preserve">C2 — Sequência dos marcos M-05 a M-07</w:t>
       </w:r>
       <w:r>
         <w:t xml:space="preserve"> </w:t>
@@ -10277,7 +9973,7 @@
         <w:t xml:space="preserve"> </w:t>
       </w:r>
       <w:r>
-        <w:t xml:space="preserve">TAP, seção 11.</w:t>
+        <w:t xml:space="preserve">TAP consolidado, seção 11.</w:t>
       </w:r>
     </w:p>
     <w:p>
@@ -10317,7 +10013,7 @@
         <w:t xml:space="preserve"> </w:t>
       </w:r>
       <w:r>
-        <w:t xml:space="preserve">(M-07) antes dos testes de bancada (M-08) e em água (M-09). Na EAP revisada, o Recebimento do ROV compreende o TAF, na instalação da empresa, e o TAM; o aceite do recebimento ocorre após os testes.</w:t>
+        <w:t xml:space="preserve">(M-05) antes dos testes de bancada (M-06) e em água (M-07). Na EAP revisada, o Recebimento do ROV compreende o TAF, na instalação da empresa, e o TAM; o aceite do recebimento ocorre após os testes.</w:t>
       </w:r>
     </w:p>
     <w:p>
@@ -10339,7 +10035,7 @@
         <w:t xml:space="preserve"> </w:t>
       </w:r>
       <w:r>
-        <w:t xml:space="preserve">Interpretação adotada: M-08 corresponde ao TAF (ensaios de bancada, segurança e autonomia) e M-09 ao TAM; M-07 registra a disponibilização e a integração de bancada do sistema. O TAP declara os marcos preliminares.</w:t>
+        <w:t xml:space="preserve">Interpretação adotada: M-06 corresponde ao TAF (ensaios de bancada, segurança e autonomia) e M-07 ao TAM; M-05 registra a disponibilização e a integração de bancada do sistema. O TAP declara os marcos preliminares.</w:t>
       </w:r>
     </w:p>
     <w:p>
@@ -10361,7 +10057,7 @@
         <w:t xml:space="preserve"> </w:t>
       </w:r>
       <w:r>
-        <w:t xml:space="preserve">Sem alteração do TAP. O cronograma detalhado, no pacote 1, deverá refinar a ordem dos marcos.</w:t>
+        <w:t xml:space="preserve">Sem alteração. O cronograma detalhado, no pacote 1, deverá refinar a ordem dos marcos.</w:t>
       </w:r>
     </w:p>
     <w:p>
@@ -10559,7 +10255,7 @@
         <w:t xml:space="preserve"> </w:t>
       </w:r>
       <w:r>
-        <w:t xml:space="preserve">· Registrado — não exige alteração</w:t>
+        <w:t xml:space="preserve">· Resolvido — TAP consolidado</w:t>
       </w:r>
     </w:p>
     <w:p>
@@ -10581,7 +10277,7 @@
         <w:t xml:space="preserve"> </w:t>
       </w:r>
       <w:r>
-        <w:t xml:space="preserve">TAP, seção 10.</w:t>
+        <w:t xml:space="preserve">Versão original do TAP, seção 10.</w:t>
       </w:r>
     </w:p>
     <w:p>
@@ -10603,7 +10299,7 @@
         <w:t xml:space="preserve"> </w:t>
       </w:r>
       <w:r>
-        <w:t xml:space="preserve">A seção 10 numera os indicadores como 8.1 a 8.5.</w:t>
+        <w:t xml:space="preserve">A seção 10 numerava os indicadores como 8.1 a 8.5.</w:t>
       </w:r>
     </w:p>
     <w:p>
@@ -10647,7 +10343,7 @@
         <w:t xml:space="preserve"> </w:t>
       </w:r>
       <w:r>
-        <w:t xml:space="preserve">Indicadores citados com a numeração original (8.1 a 8.5).</w:t>
+        <w:t xml:space="preserve">Corrigida para 10.1 a 10.5 no TAP consolidado (alteração A20).</w:t>
       </w:r>
     </w:p>
     <w:p>
@@ -10787,7 +10483,7 @@
         <w:t xml:space="preserve"> </w:t>
       </w:r>
       <w:r>
-        <w:t xml:space="preserve">a EAP revisada cobre o escopo do TAP sem alterar objetivos, requisitos de produto, restrições ou partes interessadas, com a única exceção dos itens de obtenção contratual excluídos por decisão do orientador (C1), que permanecem no TAP e dependem de alteração formal de consistência. O TAP não foi alterado.</w:t>
+        <w:t xml:space="preserve">a EAP revisada cobre 100% das entregas-chave, objetivos, requisitos e restrições do TAP consolidado, sem conteúdo contratual. A consolidação do TAP foi registrada como alteração de consistência (A1 a A25), e a versão original permanece preservada.</w:t>
       </w:r>
     </w:p>
     <w:bookmarkEnd w:id="37"/>
@@ -11189,13 +10885,34 @@
         <w:rPr>
           <w:rStyle w:val="VerbatimChar"/>
         </w:rPr>
+        <w:t xml:space="preserve">entregas/tarefa-1-revisada.md</w:t>
+      </w:r>
+      <w:r>
+        <w:t xml:space="preserve"> </w:t>
+      </w:r>
+      <w:r>
+        <w:t xml:space="preserve">— Tarefa 1, TAP consolidado (fonte do escopo).</w:t>
+      </w:r>
+    </w:p>
+    <w:p>
+      <w:pPr>
+        <w:numPr>
+          <w:ilvl w:val="0"/>
+          <w:numId w:val="1008"/>
+        </w:numPr>
+        <w:pStyle w:val="Compact"/>
+      </w:pPr>
+      <w:r>
+        <w:rPr>
+          <w:rStyle w:val="VerbatimChar"/>
+        </w:rPr>
         <w:t xml:space="preserve">tarefas/Tarefa 01 - TAP.docx</w:t>
       </w:r>
       <w:r>
         <w:t xml:space="preserve"> </w:t>
       </w:r>
       <w:r>
-        <w:t xml:space="preserve">— Tarefa 1 (fonte do escopo).</w:t>
+        <w:t xml:space="preserve">— Tarefa 1, versão original (preservada).</w:t>
       </w:r>
     </w:p>
     <w:p>

</xml_diff>